<commit_message>
Añadidas preguntas de materiales metálicos
</commit_message>
<xml_diff>
--- a/build/es_material_metals.docx
+++ b/build/es_material_metals.docx
@@ -490,6 +490,390 @@
         <w:t>Es una aleación de hierro con más del 1.76% de carbono para mejorar sus propiedades</w:t>
       </w:r>
     </w:p>
+    <w:p>
+      <w:pPr>
+        <w:pStyle w:val="ListNumber"/>
+      </w:pPr>
+      <w:r>
+        <w:t>¿Qué es el acero inoxidable?</w:t>
+      </w:r>
+    </w:p>
+    <w:p>
+      <w:pPr>
+        <w:pStyle w:val="Choice"/>
+      </w:pPr>
+      <w:r>
+        <w:t>a)</w:t>
+        <w:tab/>
+        <w:t>Una aleación de hierro y carbono, muy resistente a la oxidación</w:t>
+      </w:r>
+    </w:p>
+    <w:p>
+      <w:pPr>
+        <w:pStyle w:val="Choice"/>
+      </w:pPr>
+      <w:r>
+        <w:t>b)</w:t>
+        <w:tab/>
+        <w:t>Una aleación de hierro y cromo, muy resistente a la oxidación</w:t>
+      </w:r>
+    </w:p>
+    <w:p>
+      <w:pPr>
+        <w:pStyle w:val="Choice"/>
+      </w:pPr>
+      <w:r>
+        <w:t>c)</w:t>
+        <w:tab/>
+        <w:t>Una aleación de cobre y cinc, muy resistente a la oxidación</w:t>
+      </w:r>
+    </w:p>
+    <w:p>
+      <w:pPr>
+        <w:pStyle w:val="Choice"/>
+      </w:pPr>
+      <w:r>
+        <w:t>d)</w:t>
+        <w:tab/>
+        <w:t>Una aleación de cobre y estaño, muy resistente a la oxidación</w:t>
+      </w:r>
+    </w:p>
+    <w:p>
+      <w:pPr>
+        <w:pStyle w:val="ListNumber"/>
+      </w:pPr>
+      <w:r>
+        <w:t>¿Para qué se utiliza el acero inoxidable?</w:t>
+      </w:r>
+    </w:p>
+    <w:p>
+      <w:pPr>
+        <w:pStyle w:val="Choice"/>
+      </w:pPr>
+      <w:r>
+        <w:t>a)</w:t>
+        <w:tab/>
+        <w:t>Cables eléctricos, fuselaje de aviones, ventanas</w:t>
+      </w:r>
+    </w:p>
+    <w:p>
+      <w:pPr>
+        <w:pStyle w:val="Choice"/>
+      </w:pPr>
+      <w:r>
+        <w:t>b)</w:t>
+        <w:tab/>
+        <w:t>Campanas, hélices de barcos, cojinetes</w:t>
+      </w:r>
+    </w:p>
+    <w:p>
+      <w:pPr>
+        <w:pStyle w:val="Choice"/>
+      </w:pPr>
+      <w:r>
+        <w:t>c)</w:t>
+        <w:tab/>
+        <w:t>Tuberías, cables eléctricos, monedas</w:t>
+      </w:r>
+    </w:p>
+    <w:p>
+      <w:pPr>
+        <w:pStyle w:val="Choice"/>
+      </w:pPr>
+      <w:r>
+        <w:t>d)</w:t>
+        <w:tab/>
+        <w:t>Tuberías, cubertería, maquinaria de industria alimenticia</w:t>
+      </w:r>
+    </w:p>
+    <w:p>
+      <w:pPr>
+        <w:pStyle w:val="ListNumber"/>
+      </w:pPr>
+      <w:r>
+        <w:t>¿De qué color es el cobre?</w:t>
+      </w:r>
+    </w:p>
+    <w:p>
+      <w:pPr>
+        <w:pStyle w:val="Choice"/>
+      </w:pPr>
+      <w:r>
+        <w:t>a)</w:t>
+        <w:tab/>
+        <w:t>Amarillento y cuando se oxida, de color verdoso</w:t>
+      </w:r>
+    </w:p>
+    <w:p>
+      <w:pPr>
+        <w:pStyle w:val="Choice"/>
+      </w:pPr>
+      <w:r>
+        <w:t>b)</w:t>
+        <w:tab/>
+        <w:t>Plateado y cuando se oxida, de color rojizo</w:t>
+      </w:r>
+    </w:p>
+    <w:p>
+      <w:pPr>
+        <w:pStyle w:val="Choice"/>
+      </w:pPr>
+      <w:r>
+        <w:t>c)</w:t>
+        <w:tab/>
+        <w:t>Rojizo y cuando se oxida, de color verdoso</w:t>
+      </w:r>
+    </w:p>
+    <w:p>
+      <w:pPr>
+        <w:pStyle w:val="Choice"/>
+      </w:pPr>
+      <w:r>
+        <w:t>d)</w:t>
+        <w:tab/>
+        <w:t>Amarillento y cuando se oxida, de color rojizo</w:t>
+      </w:r>
+    </w:p>
+    <w:p>
+      <w:pPr>
+        <w:pStyle w:val="ListNumber"/>
+      </w:pPr>
+      <w:r>
+        <w:t>¿Para qué se utiliza el cobre?</w:t>
+      </w:r>
+    </w:p>
+    <w:p>
+      <w:pPr>
+        <w:pStyle w:val="Choice"/>
+      </w:pPr>
+      <w:r>
+        <w:t>a)</w:t>
+        <w:tab/>
+        <w:t>Monedas, tornillos, pomos, cerrojos</w:t>
+      </w:r>
+    </w:p>
+    <w:p>
+      <w:pPr>
+        <w:pStyle w:val="Choice"/>
+      </w:pPr>
+      <w:r>
+        <w:t>b)</w:t>
+        <w:tab/>
+        <w:t>Tuberías, cubertería, estructuras de edificios</w:t>
+      </w:r>
+    </w:p>
+    <w:p>
+      <w:pPr>
+        <w:pStyle w:val="Choice"/>
+      </w:pPr>
+      <w:r>
+        <w:t>c)</w:t>
+        <w:tab/>
+        <w:t>Tuberías, cables eléctricos, monedas</w:t>
+      </w:r>
+    </w:p>
+    <w:p>
+      <w:pPr>
+        <w:pStyle w:val="Choice"/>
+      </w:pPr>
+      <w:r>
+        <w:t>d)</w:t>
+        <w:tab/>
+        <w:t>Cables eléctricos, fuselaje de aviones, ventanas</w:t>
+      </w:r>
+    </w:p>
+    <w:p>
+      <w:pPr>
+        <w:pStyle w:val="ListNumber"/>
+      </w:pPr>
+      <w:r>
+        <w:t>¿De qué está hecho el bronce?</w:t>
+      </w:r>
+    </w:p>
+    <w:p>
+      <w:pPr>
+        <w:pStyle w:val="Choice"/>
+      </w:pPr>
+      <w:r>
+        <w:t>a)</w:t>
+        <w:tab/>
+        <w:t>Es una aleación de hierro y cromo</w:t>
+      </w:r>
+    </w:p>
+    <w:p>
+      <w:pPr>
+        <w:pStyle w:val="Choice"/>
+      </w:pPr>
+      <w:r>
+        <w:t>b)</w:t>
+        <w:tab/>
+        <w:t>Es una aleación de cobre y estaño</w:t>
+      </w:r>
+    </w:p>
+    <w:p>
+      <w:pPr>
+        <w:pStyle w:val="Choice"/>
+      </w:pPr>
+      <w:r>
+        <w:t>c)</w:t>
+        <w:tab/>
+        <w:t>Es un metal puro</w:t>
+      </w:r>
+    </w:p>
+    <w:p>
+      <w:pPr>
+        <w:pStyle w:val="Choice"/>
+      </w:pPr>
+      <w:r>
+        <w:t>d)</w:t>
+        <w:tab/>
+        <w:t>Es una aleación de cobre y cinc</w:t>
+      </w:r>
+    </w:p>
+    <w:p>
+      <w:pPr>
+        <w:pStyle w:val="ListNumber"/>
+      </w:pPr>
+      <w:r>
+        <w:t>¿Para qué se utiliza el bronce?</w:t>
+      </w:r>
+    </w:p>
+    <w:p>
+      <w:pPr>
+        <w:pStyle w:val="Choice"/>
+      </w:pPr>
+      <w:r>
+        <w:t>a)</w:t>
+        <w:tab/>
+        <w:t>Hélices de barcos, campanas, monedas</w:t>
+      </w:r>
+    </w:p>
+    <w:p>
+      <w:pPr>
+        <w:pStyle w:val="Choice"/>
+      </w:pPr>
+      <w:r>
+        <w:t>b)</w:t>
+        <w:tab/>
+        <w:t>Tuberías, cubertería, maquinaria de industria alimenticia</w:t>
+      </w:r>
+    </w:p>
+    <w:p>
+      <w:pPr>
+        <w:pStyle w:val="Choice"/>
+      </w:pPr>
+      <w:r>
+        <w:t>c)</w:t>
+        <w:tab/>
+        <w:t>Cables eléctricos, fuselaje de aviones, ventanas</w:t>
+      </w:r>
+    </w:p>
+    <w:p>
+      <w:pPr>
+        <w:pStyle w:val="Choice"/>
+      </w:pPr>
+      <w:r>
+        <w:t>d)</w:t>
+        <w:tab/>
+        <w:t>Tuberías, cables eléctricos, monedas</w:t>
+      </w:r>
+    </w:p>
+    <w:p>
+      <w:pPr>
+        <w:pStyle w:val="ListNumber"/>
+      </w:pPr>
+      <w:r>
+        <w:t>¿De qué está hecho el latón?</w:t>
+      </w:r>
+    </w:p>
+    <w:p>
+      <w:pPr>
+        <w:pStyle w:val="Choice"/>
+      </w:pPr>
+      <w:r>
+        <w:t>a)</w:t>
+        <w:tab/>
+        <w:t>Es una aleación de cobre y estaño</w:t>
+      </w:r>
+    </w:p>
+    <w:p>
+      <w:pPr>
+        <w:pStyle w:val="Choice"/>
+      </w:pPr>
+      <w:r>
+        <w:t>b)</w:t>
+        <w:tab/>
+        <w:t>Es una aleación de cobre y cinc</w:t>
+      </w:r>
+    </w:p>
+    <w:p>
+      <w:pPr>
+        <w:pStyle w:val="Choice"/>
+      </w:pPr>
+      <w:r>
+        <w:t>c)</w:t>
+        <w:tab/>
+        <w:t>Es un metal puro</w:t>
+      </w:r>
+    </w:p>
+    <w:p>
+      <w:pPr>
+        <w:pStyle w:val="Choice"/>
+      </w:pPr>
+      <w:r>
+        <w:t>d)</w:t>
+        <w:tab/>
+        <w:t>Es una aleación de hierro y cromo</w:t>
+      </w:r>
+    </w:p>
+    <w:p>
+      <w:pPr>
+        <w:pStyle w:val="ListNumber"/>
+      </w:pPr>
+      <w:r>
+        <w:t>¿Para qué se utiliza el latón?</w:t>
+      </w:r>
+    </w:p>
+    <w:p>
+      <w:pPr>
+        <w:pStyle w:val="Choice"/>
+      </w:pPr>
+      <w:r>
+        <w:t>a)</w:t>
+        <w:tab/>
+        <w:t>Monedas, tornillos, pomos, cerrojos</w:t>
+      </w:r>
+    </w:p>
+    <w:p>
+      <w:pPr>
+        <w:pStyle w:val="Choice"/>
+      </w:pPr>
+      <w:r>
+        <w:t>b)</w:t>
+        <w:tab/>
+        <w:t>Tuberías, cubertería, maquinaria de industria alimenticia</w:t>
+      </w:r>
+    </w:p>
+    <w:p>
+      <w:pPr>
+        <w:pStyle w:val="Choice"/>
+      </w:pPr>
+      <w:r>
+        <w:t>c)</w:t>
+        <w:tab/>
+        <w:t>Cables eléctricos, fuselaje de aviones, ventanas</w:t>
+      </w:r>
+    </w:p>
+    <w:p>
+      <w:pPr>
+        <w:pStyle w:val="Choice"/>
+      </w:pPr>
+      <w:r>
+        <w:t>d)</w:t>
+        <w:tab/>
+        <w:t>Tuberías, cables eléctricos, monedas</w:t>
+      </w:r>
+    </w:p>
     <w:sectPr>
       <w:pgSz w:w="12240" w:h="15840"/>
       <w:pgMar w:top="567" w:right="567" w:bottom="567" w:left="567" w:header="720" w:footer="720" w:gutter="0"/>

</xml_diff>

<commit_message>
Añadidas preguntas de materiales
</commit_message>
<xml_diff>
--- a/build/es_material_metals.docx
+++ b/build/es_material_metals.docx
@@ -553,7 +553,7 @@
       <w:r>
         <w:t>a)</w:t>
         <w:tab/>
-        <w:t>Cables eléctricos, fuselaje de aviones, ventanas</w:t>
+        <w:t>Latas, cables eléctricos, ventanas, fuselaje de aviones</w:t>
       </w:r>
     </w:p>
     <w:p>
@@ -563,7 +563,7 @@
       <w:r>
         <w:t>b)</w:t>
         <w:tab/>
-        <w:t>Campanas, hélices de barcos, cojinetes</w:t>
+        <w:t>Hélices de barcos, campanas, cojinetes</w:t>
       </w:r>
     </w:p>
     <w:p>
@@ -583,7 +583,7 @@
       <w:r>
         <w:t>d)</w:t>
         <w:tab/>
-        <w:t>Tuberías, cubertería, maquinaria de industria alimenticia</w:t>
+        <w:t>Tuberías, cubertería, fregaderos, cuchillos</w:t>
       </w:r>
     </w:p>
     <w:p>
@@ -659,7 +659,7 @@
       <w:r>
         <w:t>b)</w:t>
         <w:tab/>
-        <w:t>Tuberías, cubertería, estructuras de edificios</w:t>
+        <w:t>Tuberías, cubertería, fregaderos, cuchillos</w:t>
       </w:r>
     </w:p>
     <w:p>
@@ -679,7 +679,7 @@
       <w:r>
         <w:t>d)</w:t>
         <w:tab/>
-        <w:t>Cables eléctricos, fuselaje de aviones, ventanas</w:t>
+        <w:t>Latas, cables eléctricos, ventanas, fuselaje de aviones</w:t>
       </w:r>
     </w:p>
     <w:p>
@@ -745,7 +745,7 @@
       <w:r>
         <w:t>a)</w:t>
         <w:tab/>
-        <w:t>Hélices de barcos, campanas, monedas</w:t>
+        <w:t>Hélices de barcos, campanas, cojinetes</w:t>
       </w:r>
     </w:p>
     <w:p>
@@ -755,7 +755,7 @@
       <w:r>
         <w:t>b)</w:t>
         <w:tab/>
-        <w:t>Tuberías, cubertería, maquinaria de industria alimenticia</w:t>
+        <w:t>Tuberías, cubertería, fregaderos, cuchillos</w:t>
       </w:r>
     </w:p>
     <w:p>
@@ -765,7 +765,7 @@
       <w:r>
         <w:t>c)</w:t>
         <w:tab/>
-        <w:t>Cables eléctricos, fuselaje de aviones, ventanas</w:t>
+        <w:t>Latas, cables eléctricos, ventanas, fuselaje de aviones</w:t>
       </w:r>
     </w:p>
     <w:p>
@@ -851,7 +851,7 @@
       <w:r>
         <w:t>b)</w:t>
         <w:tab/>
-        <w:t>Tuberías, cubertería, maquinaria de industria alimenticia</w:t>
+        <w:t>Tuberías, cubertería, fregaderos, cuchillos</w:t>
       </w:r>
     </w:p>
     <w:p>
@@ -861,7 +861,7 @@
       <w:r>
         <w:t>c)</w:t>
         <w:tab/>
-        <w:t>Cables eléctricos, fuselaje de aviones, ventanas</w:t>
+        <w:t>Latas, cables eléctricos, ventanas, fuselaje de aviones</w:t>
       </w:r>
     </w:p>
     <w:p>
@@ -872,6 +872,294 @@
         <w:t>d)</w:t>
         <w:tab/>
         <w:t>Tuberías, cables eléctricos, monedas</w:t>
+      </w:r>
+    </w:p>
+    <w:p>
+      <w:pPr>
+        <w:pStyle w:val="ListNumber"/>
+      </w:pPr>
+      <w:r>
+        <w:t>¿Qué propiedades tiene el aluminio?</w:t>
+      </w:r>
+    </w:p>
+    <w:p>
+      <w:pPr>
+        <w:pStyle w:val="Choice"/>
+      </w:pPr>
+      <w:r>
+        <w:t>a)</w:t>
+        <w:tab/>
+        <w:t>Muy resistente a la oxidación, pesado y poco maleable</w:t>
+      </w:r>
+    </w:p>
+    <w:p>
+      <w:pPr>
+        <w:pStyle w:val="Choice"/>
+      </w:pPr>
+      <w:r>
+        <w:t>b)</w:t>
+        <w:tab/>
+        <w:t>Resiste poco  a la oxidación, ligero y poco maleable</w:t>
+      </w:r>
+    </w:p>
+    <w:p>
+      <w:pPr>
+        <w:pStyle w:val="Choice"/>
+      </w:pPr>
+      <w:r>
+        <w:t>c)</w:t>
+        <w:tab/>
+        <w:t>Resiste poco a la oxidación, ligero y muy maleable</w:t>
+      </w:r>
+    </w:p>
+    <w:p>
+      <w:pPr>
+        <w:pStyle w:val="Choice"/>
+      </w:pPr>
+      <w:r>
+        <w:t>d)</w:t>
+        <w:tab/>
+        <w:t>Muy resistente a la oxidación, ligero y muy maleable</w:t>
+      </w:r>
+    </w:p>
+    <w:p>
+      <w:pPr>
+        <w:pStyle w:val="ListNumber"/>
+      </w:pPr>
+      <w:r>
+        <w:t>¿Para qué se utiliza el aluminio?</w:t>
+      </w:r>
+    </w:p>
+    <w:p>
+      <w:pPr>
+        <w:pStyle w:val="Choice"/>
+      </w:pPr>
+      <w:r>
+        <w:t>a)</w:t>
+        <w:tab/>
+        <w:t>Latas, cables eléctricos, ventanas, fuselaje de aviones</w:t>
+      </w:r>
+    </w:p>
+    <w:p>
+      <w:pPr>
+        <w:pStyle w:val="Choice"/>
+      </w:pPr>
+      <w:r>
+        <w:t>b)</w:t>
+        <w:tab/>
+        <w:t>Hélices de barcos, campanas, cojinetes</w:t>
+      </w:r>
+    </w:p>
+    <w:p>
+      <w:pPr>
+        <w:pStyle w:val="Choice"/>
+      </w:pPr>
+      <w:r>
+        <w:t>c)</w:t>
+        <w:tab/>
+        <w:t>Tuberías, cubertería, fregaderos, cuchillos</w:t>
+      </w:r>
+    </w:p>
+    <w:p>
+      <w:pPr>
+        <w:pStyle w:val="Choice"/>
+      </w:pPr>
+      <w:r>
+        <w:t>d)</w:t>
+        <w:tab/>
+        <w:t>Baterías, protector de radiaciones, para hacer vídrio</w:t>
+      </w:r>
+    </w:p>
+    <w:p>
+      <w:pPr>
+        <w:pStyle w:val="ListNumber"/>
+      </w:pPr>
+      <w:r>
+        <w:t>¿Qué es la galvanización?</w:t>
+      </w:r>
+    </w:p>
+    <w:p>
+      <w:pPr>
+        <w:pStyle w:val="Choice"/>
+      </w:pPr>
+      <w:r>
+        <w:t>a)</w:t>
+        <w:tab/>
+        <w:t>Recubrir hierro con una capa de cinc para protegerle de la corrosión</w:t>
+      </w:r>
+    </w:p>
+    <w:p>
+      <w:pPr>
+        <w:pStyle w:val="Choice"/>
+      </w:pPr>
+      <w:r>
+        <w:t>b)</w:t>
+        <w:tab/>
+        <w:t>El proceso de obtención del aluminio con corrientes eléctricas</w:t>
+      </w:r>
+    </w:p>
+    <w:p>
+      <w:pPr>
+        <w:pStyle w:val="Choice"/>
+      </w:pPr>
+      <w:r>
+        <w:t>c)</w:t>
+        <w:tab/>
+        <w:t>Fundir dos metales distintos para protegerles de la corrosión</w:t>
+      </w:r>
+    </w:p>
+    <w:p>
+      <w:pPr>
+        <w:pStyle w:val="Choice"/>
+      </w:pPr>
+      <w:r>
+        <w:t>d)</w:t>
+        <w:tab/>
+        <w:t>Recubrir hierro con una capa de cromo para protegerle de la corrosión</w:t>
+      </w:r>
+    </w:p>
+    <w:p>
+      <w:pPr>
+        <w:pStyle w:val="ListNumber"/>
+      </w:pPr>
+      <w:r>
+        <w:t>¿Qué es la hojalata?</w:t>
+      </w:r>
+    </w:p>
+    <w:p>
+      <w:pPr>
+        <w:pStyle w:val="Choice"/>
+      </w:pPr>
+      <w:r>
+        <w:t>a)</w:t>
+        <w:tab/>
+        <w:t>Una lámina de acero recubierta de cinc para que no se oxide</w:t>
+      </w:r>
+    </w:p>
+    <w:p>
+      <w:pPr>
+        <w:pStyle w:val="Choice"/>
+      </w:pPr>
+      <w:r>
+        <w:t>b)</w:t>
+        <w:tab/>
+        <w:t>Una lámina de acero recubierta de plomo para que no se oxide</w:t>
+      </w:r>
+    </w:p>
+    <w:p>
+      <w:pPr>
+        <w:pStyle w:val="Choice"/>
+      </w:pPr>
+      <w:r>
+        <w:t>c)</w:t>
+        <w:tab/>
+        <w:t>Una lámina de acero recubierta de latón para que no se oxide</w:t>
+      </w:r>
+    </w:p>
+    <w:p>
+      <w:pPr>
+        <w:pStyle w:val="Choice"/>
+      </w:pPr>
+      <w:r>
+        <w:t>d)</w:t>
+        <w:tab/>
+        <w:t>Una lámina de acero recubierta de estaño para que no se oxide</w:t>
+      </w:r>
+    </w:p>
+    <w:p>
+      <w:pPr>
+        <w:pStyle w:val="ListNumber"/>
+      </w:pPr>
+      <w:r>
+        <w:t>¿Qué propiedades tiene el plomo?</w:t>
+      </w:r>
+    </w:p>
+    <w:p>
+      <w:pPr>
+        <w:pStyle w:val="Choice"/>
+      </w:pPr>
+      <w:r>
+        <w:t>a)</w:t>
+        <w:tab/>
+        <w:t>Es muy denso, mal conductor, muy maleable y muy tóxico</w:t>
+      </w:r>
+    </w:p>
+    <w:p>
+      <w:pPr>
+        <w:pStyle w:val="Choice"/>
+      </w:pPr>
+      <w:r>
+        <w:t>b)</w:t>
+        <w:tab/>
+        <w:t>Es muy denso, buen conductor, muy maleable y muy tóxico</w:t>
+      </w:r>
+    </w:p>
+    <w:p>
+      <w:pPr>
+        <w:pStyle w:val="Choice"/>
+      </w:pPr>
+      <w:r>
+        <w:t>c)</w:t>
+        <w:tab/>
+        <w:t>Es muy denso, buen conductor, muy maleable y no es tóxico</w:t>
+      </w:r>
+    </w:p>
+    <w:p>
+      <w:pPr>
+        <w:pStyle w:val="Choice"/>
+      </w:pPr>
+      <w:r>
+        <w:t>d)</w:t>
+        <w:tab/>
+        <w:t>Es muy denso, buen conductor, poco maleable y muy tóxico</w:t>
+      </w:r>
+    </w:p>
+    <w:p>
+      <w:pPr>
+        <w:pStyle w:val="ListNumber"/>
+      </w:pPr>
+      <w:r>
+        <w:t>¿Para qué se utiliza el plomo?</w:t>
+      </w:r>
+    </w:p>
+    <w:p>
+      <w:pPr>
+        <w:pStyle w:val="Choice"/>
+      </w:pPr>
+      <w:r>
+        <w:t>a)</w:t>
+        <w:tab/>
+        <w:t>Tuberías, cubertería, fregaderos, cuchillos</w:t>
+      </w:r>
+    </w:p>
+    <w:p>
+      <w:pPr>
+        <w:pStyle w:val="Choice"/>
+      </w:pPr>
+      <w:r>
+        <w:t>b)</w:t>
+        <w:tab/>
+        <w:t>Baterías, protector de radiaciones, para hacer vídrio</w:t>
+      </w:r>
+    </w:p>
+    <w:p>
+      <w:pPr>
+        <w:pStyle w:val="Choice"/>
+      </w:pPr>
+      <w:r>
+        <w:t>c)</w:t>
+        <w:tab/>
+        <w:t>Hélices de barcos, campanas, cojinetes</w:t>
+      </w:r>
+    </w:p>
+    <w:p>
+      <w:pPr>
+        <w:pStyle w:val="Choice"/>
+      </w:pPr>
+      <w:r>
+        <w:t>d)</w:t>
+        <w:tab/>
+        <w:t>Latas, cables eléctricos, ventanas, fuselaje de aviones</w:t>
       </w:r>
     </w:p>
     <w:sectPr>

</xml_diff>